<commit_message>
Update team setup and performance metric guides
</commit_message>
<xml_diff>
--- a/docs/QA_Lab_Performance_Huong_dan_de_hieu.docx
+++ b/docs/QA_Lab_Performance_Huong_dan_de_hieu.docx
@@ -10,13 +10,13 @@
         </w:pBdr>
       </w:pPr>
       <w:r>
-        <w:t>Hướng dẫn từng thành viên chạy và triển khai QA Lab</w:t>
+        <w:t>Hướng dẫn cài đặt và đọc kết quả Performance QA Lab</w:t>
       </w:r>
     </w:p>
     <w:p>
       <w:pPr/>
       <w:r>
-        <w:t>Cả bốn thành viên tải cùng một mã nguồn công khai từ GitHub nhưng làm bài trên máy riêng: chạy web local, chạy k6 và mở kết quả do chính máy mình tạo. Chỉ mở link Render hoặc xem kết quả của bạn khác thì chưa phải tự test.</w:t>
+        <w:t>Tài liệu này giúp từng thành viên tải QA Lab từ GitHub, chạy Stress, Spike và Soak trên máy riêng, rồi đọc đúng các số đo hiện trực tiếp trên web. Link Render chỉ để xem và thử nhẹ; bài k6 thật chạy từ web local.</w:t>
       </w:r>
     </w:p>
     <w:p>
@@ -42,6 +42,7 @@
       <w:tr>
         <w:trPr>
           <w:tblHeader/>
+          <w:cantSplit/>
         </w:trPr>
         <w:tc>
           <w:tcPr>
@@ -144,6 +145,9 @@
         </w:tc>
       </w:tr>
       <w:tr>
+        <w:trPr>
+          <w:cantSplit/>
+        </w:trPr>
         <w:tc>
           <w:tcPr>
             <w:tcW w:type="dxa" w:w="864"/>
@@ -162,15 +166,7 @@
             <w:vAlign w:val="center"/>
           </w:tcPr>
           <w:p>
-            <w:pPr>
-              <w:spacing w:after="0"/>
-            </w:pPr>
             <w:r>
-              <w:rPr>
-                <w:rFonts w:ascii="Arial" w:hAnsi="Arial"/>
-                <w:color w:val="000000"/>
-                <w:sz w:val="19"/>
-              </w:rPr>
               <w:t>1</w:t>
             </w:r>
           </w:p>
@@ -193,15 +189,7 @@
             <w:vAlign w:val="center"/>
           </w:tcPr>
           <w:p>
-            <w:pPr>
-              <w:spacing w:after="0"/>
-            </w:pPr>
             <w:r>
-              <w:rPr>
-                <w:rFonts w:ascii="Arial" w:hAnsi="Arial"/>
-                <w:color w:val="000000"/>
-                <w:sz w:val="19"/>
-              </w:rPr>
               <w:t>Tải code từ GitHub; cài Node.js 20+ và Grafana k6.</w:t>
             </w:r>
           </w:p>
@@ -224,21 +212,16 @@
             <w:vAlign w:val="center"/>
           </w:tcPr>
           <w:p>
-            <w:pPr>
-              <w:spacing w:after="0"/>
-            </w:pPr>
             <w:r>
-              <w:rPr>
-                <w:rFonts w:ascii="Arial" w:hAnsi="Arial"/>
-                <w:color w:val="000000"/>
-                <w:sz w:val="19"/>
-              </w:rPr>
-              <w:t>Gõ node -v và k6 version đều hiện phiên bản.</w:t>
+              <w:t>node -v, npm -v, k6 version đều hiện phiên bản.</w:t>
             </w:r>
           </w:p>
         </w:tc>
       </w:tr>
       <w:tr>
+        <w:trPr>
+          <w:cantSplit/>
+        </w:trPr>
         <w:tc>
           <w:tcPr>
             <w:tcW w:type="dxa" w:w="864"/>
@@ -258,15 +241,7 @@
             <w:vAlign w:val="center"/>
           </w:tcPr>
           <w:p>
-            <w:pPr>
-              <w:spacing w:after="0"/>
-            </w:pPr>
             <w:r>
-              <w:rPr>
-                <w:rFonts w:ascii="Arial" w:hAnsi="Arial"/>
-                <w:color w:val="000000"/>
-                <w:sz w:val="19"/>
-              </w:rPr>
               <w:t>2</w:t>
             </w:r>
           </w:p>
@@ -290,16 +265,8 @@
             <w:vAlign w:val="center"/>
           </w:tcPr>
           <w:p>
-            <w:pPr>
-              <w:spacing w:after="0"/>
-            </w:pPr>
             <w:r>
-              <w:rPr>
-                <w:rFonts w:ascii="Arial" w:hAnsi="Arial"/>
-                <w:color w:val="000000"/>
-                <w:sz w:val="19"/>
-              </w:rPr>
-              <w:t>Chạy web bằng start-windows.cmd.</w:t>
+              <w:t>Chạy start-windows.cmd rồi mở web local.</w:t>
             </w:r>
           </w:p>
         </w:tc>
@@ -322,21 +289,16 @@
             <w:vAlign w:val="center"/>
           </w:tcPr>
           <w:p>
-            <w:pPr>
-              <w:spacing w:after="0"/>
-            </w:pPr>
             <w:r>
-              <w:rPr>
-                <w:rFonts w:ascii="Arial" w:hAnsi="Arial"/>
-                <w:color w:val="000000"/>
-                <w:sz w:val="19"/>
-              </w:rPr>
-              <w:t>Mở được http://localhost:4173/ trên máy mình.</w:t>
+              <w:t>Mở được http://localhost:4173/ và nút Run local k6 sáng.</w:t>
             </w:r>
           </w:p>
         </w:tc>
       </w:tr>
       <w:tr>
+        <w:trPr>
+          <w:cantSplit/>
+        </w:trPr>
         <w:tc>
           <w:tcPr>
             <w:tcW w:type="dxa" w:w="864"/>
@@ -355,15 +317,7 @@
             <w:vAlign w:val="center"/>
           </w:tcPr>
           <w:p>
-            <w:pPr>
-              <w:spacing w:after="0"/>
-            </w:pPr>
             <w:r>
-              <w:rPr>
-                <w:rFonts w:ascii="Arial" w:hAnsi="Arial"/>
-                <w:color w:val="000000"/>
-                <w:sz w:val="19"/>
-              </w:rPr>
               <w:t>3</w:t>
             </w:r>
           </w:p>
@@ -386,16 +340,8 @@
             <w:vAlign w:val="center"/>
           </w:tcPr>
           <w:p>
-            <w:pPr>
-              <w:spacing w:after="0"/>
-            </w:pPr>
             <w:r>
-              <w:rPr>
-                <w:rFonts w:ascii="Arial" w:hAnsi="Arial"/>
-                <w:color w:val="000000"/>
-                <w:sz w:val="19"/>
-              </w:rPr>
-              <w:t>Chạy Stress, Spike và Soak bằng k6.</w:t>
+              <w:t>Bấm Run local k6 lần lượt cho Stress, Spike, Soak.</w:t>
             </w:r>
           </w:p>
         </w:tc>
@@ -417,21 +363,16 @@
             <w:vAlign w:val="center"/>
           </w:tcPr>
           <w:p>
-            <w:pPr>
-              <w:spacing w:after="0"/>
-            </w:pPr>
             <w:r>
-              <w:rPr>
-                <w:rFonts w:ascii="Arial" w:hAnsi="Arial"/>
-                <w:color w:val="000000"/>
-                <w:sz w:val="19"/>
-              </w:rPr>
-              <w:t>Thư mục results/ có ba file JSON mới của mình.</w:t>
+              <w:t>Mỗi lượt có Latest test completed và Completed at mới.</w:t>
             </w:r>
           </w:p>
         </w:tc>
       </w:tr>
       <w:tr>
+        <w:trPr>
+          <w:cantSplit/>
+        </w:trPr>
         <w:tc>
           <w:tcPr>
             <w:tcW w:type="dxa" w:w="864"/>
@@ -451,15 +392,7 @@
             <w:vAlign w:val="center"/>
           </w:tcPr>
           <w:p>
-            <w:pPr>
-              <w:spacing w:after="0"/>
-            </w:pPr>
             <w:r>
-              <w:rPr>
-                <w:rFonts w:ascii="Arial" w:hAnsi="Arial"/>
-                <w:color w:val="000000"/>
-                <w:sz w:val="19"/>
-              </w:rPr>
               <w:t>4</w:t>
             </w:r>
           </w:p>
@@ -483,16 +416,8 @@
             <w:vAlign w:val="center"/>
           </w:tcPr>
           <w:p>
-            <w:pPr>
-              <w:spacing w:after="0"/>
-            </w:pPr>
             <w:r>
-              <w:rPr>
-                <w:rFonts w:ascii="Arial" w:hAnsi="Arial"/>
-                <w:color w:val="000000"/>
-                <w:sz w:val="19"/>
-              </w:rPr>
-              <w:t>Mở từng JSON bằng Open summary.</w:t>
+              <w:t>Đọc bảng kết quả; chụp màn hình hoặc chạy script để lưu JSON.</w:t>
             </w:r>
           </w:p>
         </w:tc>
@@ -515,16 +440,8 @@
             <w:vAlign w:val="center"/>
           </w:tcPr>
           <w:p>
-            <w:pPr>
-              <w:spacing w:after="0"/>
-            </w:pPr>
             <w:r>
-              <w:rPr>
-                <w:rFonts w:ascii="Arial" w:hAnsi="Arial"/>
-                <w:color w:val="000000"/>
-                <w:sz w:val="19"/>
-              </w:rPr>
-              <w:t>Tự giải thích được p95, tỷ lệ lỗi và kết luận.</w:t>
+              <w:t>Giải thích được p95, Error rate và phase xấu.</w:t>
             </w:r>
           </w:p>
         </w:tc>
@@ -547,25 +464,19 @@
     <w:p>
       <w:pPr/>
       <w:r>
-        <w:t>Sau khi mở web local, chọn Performance rồi chọn Stress, Spike hoặc Soak. Đường trên biểu đồ là kế hoạch số người dùng ảo theo thời gian. Chọn tab chỉ đổi hình và thông số, chưa tạo tải.</w:t>
+        <w:t>Mở http://localhost:4173/ trên máy đang chạy QA Lab. Chọn Performance rồi Stress, Spike hoặc Soak. Biểu đồ là kế hoạch người dùng ảo theo thời gian; chọn tab chưa tạo tải. Nhập Local peak VUs trước khi bấm Run local k6 nếu muốn đổi mức cao nhất.</w:t>
       </w:r>
     </w:p>
     <w:p>
       <w:pPr/>
       <w:r>
-        <w:t>Ô Work factor và nút Run probe chỉ thử một request. Giá trị 60 nghĩa là API làm 60.000 vòng tính toán cho request đó. Nút này không chạy Stress test, và đổi số trong ô không đổi kịch bản k6.</w:t>
+        <w:t>Run probe chỉ gửi một request với Work factor 1–100. Ví dụ 60 khiến API làm 60.000 vòng PBKDF2. Kết quả probe nằm ngay dưới nút; nó không chạy k6, không hiện bảng Stress/Spike/Soak và không tạo file JSON.</w:t>
       </w:r>
     </w:p>
     <w:p>
       <w:pPr/>
       <w:r>
-        <w:rPr>
-          <w:b/>
-        </w:rPr>
-        <w:t xml:space="preserve">Điểm dễ nhầm nhất. </w:t>
-      </w:r>
-      <w:r>
-        <w:t>Open summary chỉ mở file JSON kết quả k6 đã tạo xong. Muốn có file mới, mỗi người phải chạy lệnh k6 trên máy mình. Link Render công khai chỉ để xem trước giao diện, không phải nơi nhóm gửi tải nặng.</w:t>
+        <w:t>Run local k6 trên web local mới tạo bài tải thật. Khi bấm, kết quả cũ được ẩn; đợi Latest test completed rồi đọc bảng bên dưới và kiểm tra Completed at. Kết quả của nút này chỉ nằm trong bộ nhớ server, mất khi tắt server. Muốn lưu JSON, dùng run-performance-windows.cmd; Open summary chỉ mở file đã có.</w:t>
       </w:r>
     </w:p>
     <w:p>
@@ -591,6 +502,7 @@
       <w:tr>
         <w:trPr>
           <w:tblHeader/>
+          <w:cantSplit/>
         </w:trPr>
         <w:tc>
           <w:tcPr>
@@ -693,6 +605,9 @@
         </w:tc>
       </w:tr>
       <w:tr>
+        <w:trPr>
+          <w:cantSplit/>
+        </w:trPr>
         <w:tc>
           <w:tcPr>
             <w:tcW w:type="dxa" w:w="1296"/>
@@ -788,6 +703,9 @@
         </w:tc>
       </w:tr>
       <w:tr>
+        <w:trPr>
+          <w:cantSplit/>
+        </w:trPr>
         <w:tc>
           <w:tcPr>
             <w:tcW w:type="dxa" w:w="1296"/>
@@ -886,6 +804,9 @@
         </w:tc>
       </w:tr>
       <w:tr>
+        <w:trPr>
+          <w:cantSplit/>
+        </w:trPr>
         <w:tc>
           <w:tcPr>
             <w:tcW w:type="dxa" w:w="1296"/>
@@ -1005,13 +926,7 @@
         <w:pStyle w:val="ListNumber"/>
       </w:pPr>
       <w:r>
-        <w:rPr>
-          <w:b/>
-        </w:rPr>
-        <w:t>Tải mã nguồn.</w:t>
-      </w:r>
-      <w:r>
-        <w:t xml:space="preserve"> Mở https://github.com/ZoeChan189/qa-playground, bấm Code &gt; Download ZIP. Giải nén ZIP vừa tải; mở thư mục có package.json, start-windows.cmd và run-performance-windows.cmd. Không chạy trực tiếp từ trong file ZIP.</w:t>
+        <w:t>Tải mã nguồn. Mở https://github.com/ZoeChan189/qa-playground, bấm Code &gt; Download ZIP, rồi giải nén. Mở thư mục có package.json, start-windows.cmd và run-performance-windows.cmd. Không chạy trực tiếp trong ZIP.</w:t>
       </w:r>
     </w:p>
     <w:p>
@@ -1019,13 +934,7 @@
         <w:pStyle w:val="ListNumber"/>
       </w:pPr>
       <w:r>
-        <w:rPr>
-          <w:b/>
-        </w:rPr>
-        <w:t>Cài Node.js 20 trở lên</w:t>
-      </w:r>
-      <w:r>
-        <w:t xml:space="preserve"> tại https://nodejs.org/en/download . Sau khi cài, mở terminal mới và gõ node -v, npm -v. Cả hai phải hiện phiên bản.</w:t>
+        <w:t>Cài Node.js 20 trở lên tại https://nodejs.org/en/download . Mở Command Prompt mới, gõ node -v và npm -v; cả hai phải hiện phiên bản.</w:t>
       </w:r>
     </w:p>
     <w:p>
@@ -1033,13 +942,7 @@
         <w:pStyle w:val="ListNumber"/>
       </w:pPr>
       <w:r>
-        <w:rPr>
-          <w:b/>
-        </w:rPr>
-        <w:t>Cài Grafana k6</w:t>
-      </w:r>
-      <w:r>
-        <w:t xml:space="preserve"> theo https://grafana.com/docs/k6/latest/set-up/install-k6/ . Mở terminal mới và gõ k6 version; phải hiện phiên bản. Mỗi thành viên đều cần k6 để tự tạo tải.</w:t>
+        <w:t>Cài Grafana k6 theo https://grafana.com/docs/k6/latest/set-up/install-k6/ . Mở Command Prompt mới, gõ k6 version; phải hiện phiên bản. Không cần tài khoản Grafana hoặc Grafana Dashboard.</w:t>
       </w:r>
     </w:p>
     <w:p>
@@ -1047,13 +950,7 @@
         <w:pStyle w:val="ListNumber"/>
       </w:pPr>
       <w:r>
-        <w:rPr>
-          <w:b/>
-        </w:rPr>
-        <w:t>Mở web local.</w:t>
-      </w:r>
-      <w:r>
-        <w:t xml:space="preserve"> Nhấp đúp start-windows.cmd. Lần đầu cần Internet để tải thư viện. Giữ cửa sổ đen này mở, rồi vào http://localhost:4173/ . Localhost là máy của chính bạn, không phải máy của người khác.</w:t>
+        <w:t>Mở web local. Nhấp đúp start-windows.cmd. Lần đầu cần Internet để cài thư viện. Giữ cửa sổ này mở, rồi vào http://localhost:4173/ trên cùng máy. Mỗi người có localhost riêng.</w:t>
       </w:r>
     </w:p>
     <w:p>
@@ -1061,13 +958,7 @@
         <w:pStyle w:val="ListNumber"/>
       </w:pPr>
       <w:r>
-        <w:rPr>
-          <w:b/>
-        </w:rPr>
-        <w:t>Chạy ba bài test.</w:t>
-      </w:r>
-      <w:r>
-        <w:t xml:space="preserve"> Nhấp đúp run-performance-windows.cmd trong cùng thư mục rồi chọn chạy cả Stress, Spike, Soak; hoặc mở terminal thứ hai tại thư mục dự án và lần lượt gõ npm run perf:stress, npm run perf:spike, npm run perf:soak. Chờ từng bài xong rồi mới chạy bài kế tiếp.</w:t>
+        <w:t>Chạy bài thật. Trên web local chọn Stress và bấm Run local k6; chờ khoảng 34 giây. Lặp lại với Spike (khoảng 22 giây) và Soak (khoảng 100 giây), từng bài một. Nút sẽ bị khóa trên Render, dù máy bạn đã cài k6.</w:t>
       </w:r>
     </w:p>
     <w:p>
@@ -1075,25 +966,13 @@
         <w:pStyle w:val="ListNumber"/>
       </w:pPr>
       <w:r>
-        <w:rPr>
-          <w:b/>
-        </w:rPr>
-        <w:t>Đọc kết quả của mình.</w:t>
-      </w:r>
-      <w:r>
-        <w:t xml:space="preserve"> Vào Performance trên web local, bấm Open summary và mở lần lượt ba file mới trong results/: stress-...json, spike-...json, soak-...json. Mỗi người giữ ba file của mình làm bằng chứng đã chạy.</w:t>
+        <w:t>Đọc kết quả mới nhất ở k6 result analysis: Scenario, Requests, p95, Error rate, Measured details, Threshold decisions và Phase comparison. Kiểm tra Completed at, rồi chụp màn hình. Nếu cần JSON để nộp, nhấp đúp run-performance-windows.cmd, chọn 5 để lưu ba file trong results/. Web local cũng tự hiện file mới nhất.</w:t>
       </w:r>
     </w:p>
     <w:p>
       <w:pPr/>
       <w:r>
-        <w:rPr>
-          <w:b/>
-        </w:rPr>
-        <w:t xml:space="preserve">Rất quan trọng. </w:t>
-      </w:r>
-      <w:r>
-        <w:t>Chỉ chạy k6 vào localhost của bạn. Đừng gửi Stress, Spike hoặc Soak vào link Render công khai: việc đó làm sai phép đo và có thể ảnh hưởng server dùng chung.</w:t>
+        <w:t>Rất quan trọng. Chỉ chạy k6 vào localhost của bạn. Không gửi tải Stress, Spike hoặc Soak vào link Render công khai: server dùng chung có thể bị ảnh hưởng hoặc phát sinh chi phí. Bản Render không được phép tự mở k6.exe trên máy người xem.</w:t>
       </w:r>
     </w:p>
     <w:p>
@@ -1118,6 +997,7 @@
       <w:tr>
         <w:trPr>
           <w:tblHeader/>
+          <w:cantSplit/>
         </w:trPr>
         <w:tc>
           <w:tcPr>
@@ -1187,6 +1067,9 @@
         </w:tc>
       </w:tr>
       <w:tr>
+        <w:trPr>
+          <w:cantSplit/>
+        </w:trPr>
         <w:tc>
           <w:tcPr>
             <w:tcW w:type="dxa" w:w="3168"/>
@@ -1251,6 +1134,9 @@
         </w:tc>
       </w:tr>
       <w:tr>
+        <w:trPr>
+          <w:cantSplit/>
+        </w:trPr>
         <w:tc>
           <w:tcPr>
             <w:tcW w:type="dxa" w:w="3168"/>
@@ -1270,16 +1156,8 @@
             <w:vAlign w:val="center"/>
           </w:tcPr>
           <w:p>
-            <w:pPr>
-              <w:spacing w:after="0"/>
-            </w:pPr>
             <w:r>
-              <w:rPr>
-                <w:rFonts w:ascii="Arial" w:hAnsi="Arial"/>
-                <w:color w:val="000000"/>
-                <w:sz w:val="19"/>
-              </w:rPr>
-              <w:t>Thiếu k6</w:t>
+              <w:t>Thiếu k6 / nút Run local k6 mờ</w:t>
             </w:r>
           </w:p>
         </w:tc>
@@ -1302,21 +1180,16 @@
             <w:vAlign w:val="center"/>
           </w:tcPr>
           <w:p>
-            <w:pPr>
-              <w:spacing w:after="0"/>
-            </w:pPr>
             <w:r>
-              <w:rPr>
-                <w:rFonts w:ascii="Arial" w:hAnsi="Arial"/>
-                <w:color w:val="000000"/>
-                <w:sz w:val="19"/>
-              </w:rPr>
-              <w:t>Cài Grafana k6 rồi mở terminal mới; web local vẫn dùng được khi chưa có k6.</w:t>
+              <w:t>Cài k6, mở terminal mới, khởi động lại web local. Trên Render nút luôn bị khóa.</w:t>
             </w:r>
           </w:p>
         </w:tc>
       </w:tr>
       <w:tr>
+        <w:trPr>
+          <w:cantSplit/>
+        </w:trPr>
         <w:tc>
           <w:tcPr>
             <w:tcW w:type="dxa" w:w="3168"/>
@@ -1381,6 +1254,9 @@
         </w:tc>
       </w:tr>
       <w:tr>
+        <w:trPr>
+          <w:cantSplit/>
+        </w:trPr>
         <w:tc>
           <w:tcPr>
             <w:tcW w:type="dxa" w:w="3168"/>
@@ -1400,15 +1276,7 @@
             <w:vAlign w:val="center"/>
           </w:tcPr>
           <w:p>
-            <w:pPr>
-              <w:spacing w:after="0"/>
-            </w:pPr>
             <w:r>
-              <w:rPr>
-                <w:rFonts w:ascii="Arial" w:hAnsi="Arial"/>
-                <w:color w:val="000000"/>
-                <w:sz w:val="19"/>
-              </w:rPr>
               <w:t>k6 báo threshold failed</w:t>
             </w:r>
           </w:p>
@@ -1432,21 +1300,16 @@
             <w:vAlign w:val="center"/>
           </w:tcPr>
           <w:p>
-            <w:pPr>
-              <w:spacing w:after="0"/>
-            </w:pPr>
             <w:r>
-              <w:rPr>
-                <w:rFonts w:ascii="Arial" w:hAnsi="Arial"/>
-                <w:color w:val="000000"/>
-                <w:sz w:val="19"/>
-              </w:rPr>
-              <w:t>Đây có thể là kết quả bài test không đạt ngưỡng. Vẫn mở file JSON trong results/ để xem p95, lỗi và từng giai đoạn.</w:t>
+              <w:t>Bài đã chạy nhưng ít nhất một ngưỡng không đạt. Xem Threshold decisions và Phase comparison.</w:t>
             </w:r>
           </w:p>
         </w:tc>
       </w:tr>
       <w:tr>
+        <w:trPr>
+          <w:cantSplit/>
+        </w:trPr>
         <w:tc>
           <w:tcPr>
             <w:tcW w:type="dxa" w:w="3168"/>
@@ -1533,7 +1396,7 @@
     <w:p>
       <w:pPr/>
       <w:r>
-        <w:t>Work factor là mức việc tính toán cho một request khi bạn bấm Run probe. API lấy số đó nhân 1.000 để tạo số vòng PBKDF2. Số càng lớn thường càng nặng, nhưng thời gian chạy không cố định vì còn tùy máy và lúc đó server bận hay rảnh.</w:t>
+        <w:t>Work factor là mức tính toán cho một request khi bấm Run probe. API nhân số nhập với 1.000 vòng PBKDF2: nhập 1 là 1.000 vòng, 60 là 60.000 vòng, 100 là 100.000 vòng. Số lớn thường nặng hơn nhưng không thể hứa trước thời gian ms, vì còn tùy máy và mức bận.</w:t>
       </w:r>
     </w:p>
     <w:tbl>
@@ -1549,6 +1412,7 @@
       <w:tr>
         <w:trPr>
           <w:tblHeader/>
+          <w:cantSplit/>
         </w:trPr>
         <w:tc>
           <w:tcPr>
@@ -1618,6 +1482,9 @@
         </w:tc>
       </w:tr>
       <w:tr>
+        <w:trPr>
+          <w:cantSplit/>
+        </w:trPr>
         <w:tc>
           <w:tcPr>
             <w:tcW w:type="dxa" w:w="2376"/>
@@ -1682,6 +1549,9 @@
         </w:tc>
       </w:tr>
       <w:tr>
+        <w:trPr>
+          <w:cantSplit/>
+        </w:trPr>
         <w:tc>
           <w:tcPr>
             <w:tcW w:type="dxa" w:w="2376"/>
@@ -1748,6 +1618,9 @@
         </w:tc>
       </w:tr>
       <w:tr>
+        <w:trPr>
+          <w:cantSplit/>
+        </w:trPr>
         <w:tc>
           <w:tcPr>
             <w:tcW w:type="dxa" w:w="2376"/>
@@ -1812,6 +1685,9 @@
         </w:tc>
       </w:tr>
       <w:tr>
+        <w:trPr>
+          <w:cantSplit/>
+        </w:trPr>
         <w:tc>
           <w:tcPr>
             <w:tcW w:type="dxa" w:w="2376"/>
@@ -1886,7 +1762,7 @@
     <w:p>
       <w:pPr/>
       <w:r>
-        <w:t>Nếu API đang đầy có thể thấy HTTP 503; trên bản Render công khai, gửi quá nhanh có thể thấy HTTP 429. Đổi Work factor trên web chỉ đổi lần probe này, không đổi số VU, thời lượng hay mức work trong các lệnh npm run perf:stress, perf:spike, perf:soak.</w:t>
+        <w:t>Nếu API đầy có thể thấy HTTP 503; trên Render, gửi quá nhanh có thể thấy HTTP 429. Client ms là thời gian trình duyệt đo, server ms là thời gian API tự đo. Thay Work factor chỉ đổi probe, không đổi work, VU hay thời lượng của bài k6.</w:t>
       </w:r>
     </w:p>
     <w:p>
@@ -1911,6 +1787,7 @@
       <w:tr>
         <w:trPr>
           <w:tblHeader/>
+          <w:cantSplit/>
         </w:trPr>
         <w:tc>
           <w:tcPr>
@@ -1980,6 +1857,9 @@
         </w:tc>
       </w:tr>
       <w:tr>
+        <w:trPr>
+          <w:cantSplit/>
+        </w:trPr>
         <w:tc>
           <w:tcPr>
             <w:tcW w:type="dxa" w:w="3312"/>
@@ -1998,15 +1878,7 @@
             <w:vAlign w:val="center"/>
           </w:tcPr>
           <w:p>
-            <w:pPr>
-              <w:spacing w:after="0"/>
-            </w:pPr>
             <w:r>
-              <w:rPr>
-                <w:rFonts w:ascii="Arial" w:hAnsi="Arial"/>
-                <w:color w:val="000000"/>
-                <w:sz w:val="19"/>
-              </w:rPr>
               <w:t>API online</w:t>
             </w:r>
           </w:p>
@@ -2029,21 +1901,16 @@
             <w:vAlign w:val="center"/>
           </w:tcPr>
           <w:p>
-            <w:pPr>
-              <w:spacing w:after="0"/>
-            </w:pPr>
             <w:r>
-              <w:rPr>
-                <w:rFonts w:ascii="Arial" w:hAnsi="Arial"/>
-                <w:color w:val="000000"/>
-                <w:sz w:val="19"/>
-              </w:rPr>
-              <w:t>Server đang trả lời; chưa chứng minh bài performance đạt.</w:t>
+              <w:t>Server đang phản hồi; chưa chứng minh performance đạt.</w:t>
             </w:r>
           </w:p>
         </w:tc>
       </w:tr>
       <w:tr>
+        <w:trPr>
+          <w:cantSplit/>
+        </w:trPr>
         <w:tc>
           <w:tcPr>
             <w:tcW w:type="dxa" w:w="3312"/>
@@ -2063,16 +1930,8 @@
             <w:vAlign w:val="center"/>
           </w:tcPr>
           <w:p>
-            <w:pPr>
-              <w:spacing w:after="0"/>
-            </w:pPr>
             <w:r>
-              <w:rPr>
-                <w:rFonts w:ascii="Arial" w:hAnsi="Arial"/>
-                <w:color w:val="000000"/>
-                <w:sz w:val="19"/>
-              </w:rPr>
-              <w:t>Peak users, ví dụ 40 VUs</w:t>
+              <w:t>Peak users / Local peak VUs</w:t>
             </w:r>
           </w:p>
         </w:tc>
@@ -2095,21 +1954,16 @@
             <w:vAlign w:val="center"/>
           </w:tcPr>
           <w:p>
-            <w:pPr>
-              <w:spacing w:after="0"/>
-            </w:pPr>
             <w:r>
-              <w:rPr>
-                <w:rFonts w:ascii="Arial" w:hAnsi="Arial"/>
-                <w:color w:val="000000"/>
-                <w:sz w:val="19"/>
-              </w:rPr>
-              <w:t>Số người dùng ảo cao nhất dự kiến trong kịch bản, không phải số người thật hay số request mỗi giây.</w:t>
+              <w:t>Số người dùng ảo cao nhất dự kiến; nhập 1–200, riêng Spike 5–200. Không phải request/giây.</w:t>
             </w:r>
           </w:p>
         </w:tc>
       </w:tr>
       <w:tr>
+        <w:trPr>
+          <w:cantSplit/>
+        </w:trPr>
         <w:tc>
           <w:tcPr>
             <w:tcW w:type="dxa" w:w="3312"/>
@@ -2128,16 +1982,8 @@
             <w:vAlign w:val="center"/>
           </w:tcPr>
           <w:p>
-            <w:pPr>
-              <w:spacing w:after="0"/>
-            </w:pPr>
             <w:r>
-              <w:rPr>
-                <w:rFonts w:ascii="Arial" w:hAnsi="Arial"/>
-                <w:color w:val="000000"/>
-                <w:sz w:val="19"/>
-              </w:rPr>
-              <w:t>PBKDF2 work, ví dụ 60.000</w:t>
+              <w:t>PBKDF2 work</w:t>
             </w:r>
           </w:p>
         </w:tc>
@@ -2159,21 +2005,16 @@
             <w:vAlign w:val="center"/>
           </w:tcPr>
           <w:p>
-            <w:pPr>
-              <w:spacing w:after="0"/>
-            </w:pPr>
             <w:r>
-              <w:rPr>
-                <w:rFonts w:ascii="Arial" w:hAnsi="Arial"/>
-                <w:color w:val="000000"/>
-                <w:sz w:val="19"/>
-              </w:rPr>
-              <w:t>Số vòng tính toán mà API làm cho mỗi request được nhận.</w:t>
+              <w:t>Số vòng tính toán mỗi request được nhận: Stress/Spike 60.000; Soak 25.000; Load 20.000.</w:t>
             </w:r>
           </w:p>
         </w:tc>
       </w:tr>
       <w:tr>
+        <w:trPr>
+          <w:cantSplit/>
+        </w:trPr>
         <w:tc>
           <w:tcPr>
             <w:tcW w:type="dxa" w:w="3312"/>
@@ -2193,15 +2034,7 @@
             <w:vAlign w:val="center"/>
           </w:tcPr>
           <w:p>
-            <w:pPr>
-              <w:spacing w:after="0"/>
-            </w:pPr>
             <w:r>
-              <w:rPr>
-                <w:rFonts w:ascii="Arial" w:hAnsi="Arial"/>
-                <w:color w:val="000000"/>
-                <w:sz w:val="19"/>
-              </w:rPr>
               <w:t>Active jobs / of 24 capacity</w:t>
             </w:r>
           </w:p>
@@ -2225,21 +2058,16 @@
             <w:vAlign w:val="center"/>
           </w:tcPr>
           <w:p>
-            <w:pPr>
-              <w:spacing w:after="0"/>
-            </w:pPr>
             <w:r>
-              <w:rPr>
-                <w:rFonts w:ascii="Arial" w:hAnsi="Arial"/>
-                <w:color w:val="000000"/>
-                <w:sz w:val="19"/>
-              </w:rPr>
-              <w:t>Số công việc đang chạy lúc lấy mẫu / tối đa 24 công việc đồng thời. 40 VUs không có nghĩa luôn có 40 jobs.</w:t>
+              <w:t>Số job đang chạy lúc lấy mẫu / tối đa 24 job đồng thời. VU không luôn bằng job.</w:t>
             </w:r>
           </w:p>
         </w:tc>
       </w:tr>
       <w:tr>
+        <w:trPr>
+          <w:cantSplit/>
+        </w:trPr>
         <w:tc>
           <w:tcPr>
             <w:tcW w:type="dxa" w:w="3312"/>
@@ -2258,15 +2086,7 @@
             <w:vAlign w:val="center"/>
           </w:tcPr>
           <w:p>
-            <w:pPr>
-              <w:spacing w:after="0"/>
-            </w:pPr>
             <w:r>
-              <w:rPr>
-                <w:rFonts w:ascii="Arial" w:hAnsi="Arial"/>
-                <w:color w:val="000000"/>
-                <w:sz w:val="19"/>
-              </w:rPr>
               <w:t>Completed; Rejected</w:t>
             </w:r>
           </w:p>
@@ -2289,21 +2109,16 @@
             <w:vAlign w:val="center"/>
           </w:tcPr>
           <w:p>
-            <w:pPr>
-              <w:spacing w:after="0"/>
-            </w:pPr>
             <w:r>
-              <w:rPr>
-                <w:rFonts w:ascii="Arial" w:hAnsi="Arial"/>
-                <w:color w:val="000000"/>
-                <w:sz w:val="19"/>
-              </w:rPr>
-              <w:t>Đã xử lý xong từ khi server mở; số bị từ chối vì đầy và trả 503. Server khởi động lại thì số đếm bắt đầu lại.</w:t>
+              <w:t>Số job xử lý xong và số request bị từ chối 503 kể từ khi server khởi động, không phải riêng bài mới.</w:t>
             </w:r>
           </w:p>
         </w:tc>
       </w:tr>
       <w:tr>
+        <w:trPr>
+          <w:cantSplit/>
+        </w:trPr>
         <w:tc>
           <w:tcPr>
             <w:tcW w:type="dxa" w:w="3312"/>
@@ -2323,15 +2138,7 @@
             <w:vAlign w:val="center"/>
           </w:tcPr>
           <w:p>
-            <w:pPr>
-              <w:spacing w:after="0"/>
-            </w:pPr>
             <w:r>
-              <w:rPr>
-                <w:rFonts w:ascii="Arial" w:hAnsi="Arial"/>
-                <w:color w:val="000000"/>
-                <w:sz w:val="19"/>
-              </w:rPr>
               <w:t>Server p95; Node heap</w:t>
             </w:r>
           </w:p>
@@ -2355,21 +2162,16 @@
             <w:vAlign w:val="center"/>
           </w:tcPr>
           <w:p>
-            <w:pPr>
-              <w:spacing w:after="0"/>
-            </w:pPr>
             <w:r>
-              <w:rPr>
-                <w:rFonts w:ascii="Arial" w:hAnsi="Arial"/>
-                <w:color w:val="000000"/>
-                <w:sz w:val="19"/>
-              </w:rPr>
-              <w:t>Mốc 95% thời gian xử lý của server ở 1.000 job gần nhất, khác p95 HTTP do k6 đo; bộ nhớ tiến trình Node, không phải toàn bộ RAM.</w:t>
+              <w:t>Server p95 là tối đa 1.000 job được nhận gần nhất; Node heap là bộ nhớ tiến trình. Khác p95 HTTP và Heap range của lượt k6.</w:t>
             </w:r>
           </w:p>
         </w:tc>
       </w:tr>
       <w:tr>
+        <w:trPr>
+          <w:cantSplit/>
+        </w:trPr>
         <w:tc>
           <w:tcPr>
             <w:tcW w:type="dxa" w:w="3312"/>
@@ -2388,15 +2190,7 @@
             <w:vAlign w:val="center"/>
           </w:tcPr>
           <w:p>
-            <w:pPr>
-              <w:spacing w:after="0"/>
-            </w:pPr>
             <w:r>
-              <w:rPr>
-                <w:rFonts w:ascii="Arial" w:hAnsi="Arial"/>
-                <w:color w:val="000000"/>
-                <w:sz w:val="19"/>
-              </w:rPr>
               <w:t>Requests; p95; Error rate</w:t>
             </w:r>
           </w:p>
@@ -2419,21 +2213,16 @@
             <w:vAlign w:val="center"/>
           </w:tcPr>
           <w:p>
-            <w:pPr>
-              <w:spacing w:after="0"/>
-            </w:pPr>
             <w:r>
-              <w:rPr>
-                <w:rFonts w:ascii="Arial" w:hAnsi="Arial"/>
-                <w:color w:val="000000"/>
-                <w:sz w:val="19"/>
-              </w:rPr>
-              <w:t>Sau khi mở JSON: tổng request k6 đo; mốc thời gian HTTP của 95% request; phần trăm request lỗi.</w:t>
+              <w:t>Tổng request k6 gửi; mốc 95% thời gian phản hồi HTTP; phần trăm request lỗi của một lượt.</w:t>
             </w:r>
           </w:p>
         </w:tc>
       </w:tr>
       <w:tr>
+        <w:trPr>
+          <w:cantSplit/>
+        </w:trPr>
         <w:tc>
           <w:tcPr>
             <w:tcW w:type="dxa" w:w="3312"/>
@@ -2453,15 +2242,7 @@
             <w:vAlign w:val="center"/>
           </w:tcPr>
           <w:p>
-            <w:pPr>
-              <w:spacing w:after="0"/>
-            </w:pPr>
             <w:r>
-              <w:rPr>
-                <w:rFonts w:ascii="Arial" w:hAnsi="Arial"/>
-                <w:color w:val="000000"/>
-                <w:sz w:val="19"/>
-              </w:rPr>
               <w:t>Peak active; Heap range</w:t>
             </w:r>
           </w:p>
@@ -2485,21 +2266,16 @@
             <w:vAlign w:val="center"/>
           </w:tcPr>
           <w:p>
-            <w:pPr>
-              <w:spacing w:after="0"/>
-            </w:pPr>
             <w:r>
-              <w:rPr>
-                <w:rFonts w:ascii="Arial" w:hAnsi="Arial"/>
-                <w:color w:val="000000"/>
-                <w:sz w:val="19"/>
-              </w:rPr>
-              <w:t>Số job đang chạy cao nhất và khoảng bộ nhớ thấp nhất đến cao nhất trong các mẫu k6 nhận được.</w:t>
+              <w:t>Mức job đồng thời cao nhất và khoảng bộ nhớ k6 quan sát từ phản hồi thành công; không chứng minh leak.</w:t>
             </w:r>
           </w:p>
         </w:tc>
       </w:tr>
       <w:tr>
+        <w:trPr>
+          <w:cantSplit/>
+        </w:trPr>
         <w:tc>
           <w:tcPr>
             <w:tcW w:type="dxa" w:w="3312"/>
@@ -2518,15 +2294,7 @@
             <w:vAlign w:val="center"/>
           </w:tcPr>
           <w:p>
-            <w:pPr>
-              <w:spacing w:after="0"/>
-            </w:pPr>
             <w:r>
-              <w:rPr>
-                <w:rFonts w:ascii="Arial" w:hAnsi="Arial"/>
-                <w:color w:val="000000"/>
-                <w:sz w:val="19"/>
-              </w:rPr>
               <w:t>Phase comparison</w:t>
             </w:r>
           </w:p>
@@ -2549,16 +2317,424 @@
             <w:vAlign w:val="center"/>
           </w:tcPr>
           <w:p>
-            <w:pPr>
-              <w:spacing w:after="0"/>
-            </w:pPr>
             <w:r>
-              <w:rPr>
-                <w:rFonts w:ascii="Arial" w:hAnsi="Arial"/>
-                <w:color w:val="000000"/>
-                <w:sz w:val="19"/>
-              </w:rPr>
-              <w:t>So từng giai đoạn tăng tải, giữ tải, giảm tải. Tổng bài đạt vẫn có thể có một giai đoạn xấu.</w:t>
+              <w:t>Số request, p95 và lỗi theo cửa sổ thời gian: Stress tăng tải, Spike baseline/burst/recovery, Soak early/late.</w:t>
+            </w:r>
+          </w:p>
+        </w:tc>
+      </w:tr>
+      <w:tr>
+        <w:trPr>
+          <w:cantSplit/>
+        </w:trPr>
+        <w:tc>
+          <w:tcPr>
+            <w:tcW w:type="dxa" w:w="3312"/>
+            <w:shd w:fill="F7FAFB"/>
+            <w:tcBorders>
+              <w:top w:val="single" w:sz="4" w:color="D9D9D9"/>
+              <w:left w:val="single" w:sz="4" w:color="D9D9D9"/>
+              <w:bottom w:val="single" w:sz="4" w:color="D9D9D9"/>
+              <w:right w:val="single" w:sz="4" w:color="D9D9D9"/>
+            </w:tcBorders>
+            <w:tcMar>
+              <w:top w:w="95" w:type="dxa"/>
+              <w:bottom w:w="95" w:type="dxa"/>
+              <w:left w:w="120" w:type="dxa"/>
+              <w:right w:w="120" w:type="dxa"/>
+            </w:tcMar>
+            <w:vAlign w:val="center"/>
+          </w:tcPr>
+          <w:p>
+            <w:r>
+              <w:t>Completed at; Configured peak</w:t>
+            </w:r>
+          </w:p>
+        </w:tc>
+        <w:tc>
+          <w:tcPr>
+            <w:tcW w:type="dxa" w:w="6624"/>
+            <w:shd w:fill="F7FAFB"/>
+            <w:tcBorders>
+              <w:top w:val="single" w:sz="4" w:color="D9D9D9"/>
+              <w:left w:val="single" w:sz="4" w:color="D9D9D9"/>
+              <w:bottom w:val="single" w:sz="4" w:color="D9D9D9"/>
+              <w:right w:val="single" w:sz="4" w:color="D9D9D9"/>
+            </w:tcBorders>
+            <w:tcMar>
+              <w:top w:w="95" w:type="dxa"/>
+              <w:bottom w:w="95" w:type="dxa"/>
+              <w:left w:w="120" w:type="dxa"/>
+              <w:right w:w="120" w:type="dxa"/>
+            </w:tcMar>
+            <w:vAlign w:val="center"/>
+          </w:tcPr>
+          <w:p>
+            <w:r>
+              <w:t>Thời điểm hoàn tất và VU cao nhất của lượt này. Dùng để phân biệt kết quả mới/cũ.</w:t>
+            </w:r>
+          </w:p>
+        </w:tc>
+      </w:tr>
+      <w:tr>
+        <w:trPr>
+          <w:cantSplit/>
+        </w:trPr>
+        <w:tc>
+          <w:tcPr>
+            <w:tcW w:type="dxa" w:w="3312"/>
+            <w:tcBorders>
+              <w:top w:val="single" w:sz="4" w:color="D9D9D9"/>
+              <w:left w:val="single" w:sz="4" w:color="D9D9D9"/>
+              <w:bottom w:val="single" w:sz="4" w:color="D9D9D9"/>
+              <w:right w:val="single" w:sz="4" w:color="D9D9D9"/>
+            </w:tcBorders>
+            <w:tcMar>
+              <w:top w:w="95" w:type="dxa"/>
+              <w:bottom w:w="95" w:type="dxa"/>
+              <w:left w:w="120" w:type="dxa"/>
+              <w:right w:w="120" w:type="dxa"/>
+            </w:tcMar>
+            <w:vAlign w:val="center"/>
+          </w:tcPr>
+          <w:p>
+            <w:r>
+              <w:t>Requests per second</w:t>
+            </w:r>
+          </w:p>
+        </w:tc>
+        <w:tc>
+          <w:tcPr>
+            <w:tcW w:type="dxa" w:w="6624"/>
+            <w:tcBorders>
+              <w:top w:val="single" w:sz="4" w:color="D9D9D9"/>
+              <w:left w:val="single" w:sz="4" w:color="D9D9D9"/>
+              <w:bottom w:val="single" w:sz="4" w:color="D9D9D9"/>
+              <w:right w:val="single" w:sz="4" w:color="D9D9D9"/>
+            </w:tcBorders>
+            <w:tcMar>
+              <w:top w:w="95" w:type="dxa"/>
+              <w:bottom w:w="95" w:type="dxa"/>
+              <w:left w:w="120" w:type="dxa"/>
+              <w:right w:w="120" w:type="dxa"/>
+            </w:tcMar>
+            <w:vAlign w:val="center"/>
+          </w:tcPr>
+          <w:p>
+            <w:r>
+              <w:t>Request HTTP hoàn tất mỗi giây tính trung bình cả lượt; khác số VU.</w:t>
+            </w:r>
+          </w:p>
+        </w:tc>
+      </w:tr>
+      <w:tr>
+        <w:trPr>
+          <w:cantSplit/>
+        </w:trPr>
+        <w:tc>
+          <w:tcPr>
+            <w:tcW w:type="dxa" w:w="3312"/>
+            <w:shd w:fill="F7FAFB"/>
+            <w:tcBorders>
+              <w:top w:val="single" w:sz="4" w:color="D9D9D9"/>
+              <w:left w:val="single" w:sz="4" w:color="D9D9D9"/>
+              <w:bottom w:val="single" w:sz="4" w:color="D9D9D9"/>
+              <w:right w:val="single" w:sz="4" w:color="D9D9D9"/>
+            </w:tcBorders>
+            <w:tcMar>
+              <w:top w:w="95" w:type="dxa"/>
+              <w:bottom w:w="95" w:type="dxa"/>
+              <w:left w:w="120" w:type="dxa"/>
+              <w:right w:w="120" w:type="dxa"/>
+            </w:tcMar>
+            <w:vAlign w:val="center"/>
+          </w:tcPr>
+          <w:p>
+            <w:r>
+              <w:t>Failed requests</w:t>
+            </w:r>
+          </w:p>
+        </w:tc>
+        <w:tc>
+          <w:tcPr>
+            <w:tcW w:type="dxa" w:w="6624"/>
+            <w:shd w:fill="F7FAFB"/>
+            <w:tcBorders>
+              <w:top w:val="single" w:sz="4" w:color="D9D9D9"/>
+              <w:left w:val="single" w:sz="4" w:color="D9D9D9"/>
+              <w:bottom w:val="single" w:sz="4" w:color="D9D9D9"/>
+              <w:right w:val="single" w:sz="4" w:color="D9D9D9"/>
+            </w:tcBorders>
+            <w:tcMar>
+              <w:top w:w="95" w:type="dxa"/>
+              <w:bottom w:w="95" w:type="dxa"/>
+              <w:left w:w="120" w:type="dxa"/>
+              <w:right w:w="120" w:type="dxa"/>
+            </w:tcMar>
+            <w:vAlign w:val="center"/>
+          </w:tcPr>
+          <w:p>
+            <w:r>
+              <w:t>Số request HTTP bị k6 tính là lỗi. Error rate = số lỗi chia tổng Requests.</w:t>
+            </w:r>
+          </w:p>
+        </w:tc>
+      </w:tr>
+      <w:tr>
+        <w:trPr>
+          <w:cantSplit/>
+        </w:trPr>
+        <w:tc>
+          <w:tcPr>
+            <w:tcW w:type="dxa" w:w="3312"/>
+            <w:tcBorders>
+              <w:top w:val="single" w:sz="4" w:color="D9D9D9"/>
+              <w:left w:val="single" w:sz="4" w:color="D9D9D9"/>
+              <w:bottom w:val="single" w:sz="4" w:color="D9D9D9"/>
+              <w:right w:val="single" w:sz="4" w:color="D9D9D9"/>
+            </w:tcBorders>
+            <w:tcMar>
+              <w:top w:w="95" w:type="dxa"/>
+              <w:bottom w:w="95" w:type="dxa"/>
+              <w:left w:w="120" w:type="dxa"/>
+              <w:right w:w="120" w:type="dxa"/>
+            </w:tcMar>
+            <w:vAlign w:val="center"/>
+          </w:tcPr>
+          <w:p>
+            <w:r>
+              <w:t>HTTP 200; HTTP 503; Other status</w:t>
+            </w:r>
+          </w:p>
+        </w:tc>
+        <w:tc>
+          <w:tcPr>
+            <w:tcW w:type="dxa" w:w="6624"/>
+            <w:tcBorders>
+              <w:top w:val="single" w:sz="4" w:color="D9D9D9"/>
+              <w:left w:val="single" w:sz="4" w:color="D9D9D9"/>
+              <w:bottom w:val="single" w:sz="4" w:color="D9D9D9"/>
+              <w:right w:val="single" w:sz="4" w:color="D9D9D9"/>
+            </w:tcBorders>
+            <w:tcMar>
+              <w:top w:w="95" w:type="dxa"/>
+              <w:bottom w:w="95" w:type="dxa"/>
+              <w:left w:w="120" w:type="dxa"/>
+              <w:right w:w="120" w:type="dxa"/>
+            </w:tcMar>
+            <w:vAlign w:val="center"/>
+          </w:tcPr>
+          <w:p>
+            <w:r>
+              <w:t>Số phản hồi thành công; bị từ chối vì đầy; phản hồi khác hoặc timeout.</w:t>
+            </w:r>
+          </w:p>
+        </w:tc>
+      </w:tr>
+      <w:tr>
+        <w:trPr>
+          <w:cantSplit/>
+        </w:trPr>
+        <w:tc>
+          <w:tcPr>
+            <w:tcW w:type="dxa" w:w="3312"/>
+            <w:shd w:fill="F7FAFB"/>
+            <w:tcBorders>
+              <w:top w:val="single" w:sz="4" w:color="D9D9D9"/>
+              <w:left w:val="single" w:sz="4" w:color="D9D9D9"/>
+              <w:bottom w:val="single" w:sz="4" w:color="D9D9D9"/>
+              <w:right w:val="single" w:sz="4" w:color="D9D9D9"/>
+            </w:tcBorders>
+            <w:tcMar>
+              <w:top w:w="95" w:type="dxa"/>
+              <w:bottom w:w="95" w:type="dxa"/>
+              <w:left w:w="120" w:type="dxa"/>
+              <w:right w:w="120" w:type="dxa"/>
+            </w:tcMar>
+            <w:vAlign w:val="center"/>
+          </w:tcPr>
+          <w:p>
+            <w:r>
+              <w:t>Latency min / average / median</w:t>
+            </w:r>
+          </w:p>
+        </w:tc>
+        <w:tc>
+          <w:tcPr>
+            <w:tcW w:type="dxa" w:w="6624"/>
+            <w:shd w:fill="F7FAFB"/>
+            <w:tcBorders>
+              <w:top w:val="single" w:sz="4" w:color="D9D9D9"/>
+              <w:left w:val="single" w:sz="4" w:color="D9D9D9"/>
+              <w:bottom w:val="single" w:sz="4" w:color="D9D9D9"/>
+              <w:right w:val="single" w:sz="4" w:color="D9D9D9"/>
+            </w:tcBorders>
+            <w:tcMar>
+              <w:top w:w="95" w:type="dxa"/>
+              <w:bottom w:w="95" w:type="dxa"/>
+              <w:left w:w="120" w:type="dxa"/>
+              <w:right w:w="120" w:type="dxa"/>
+            </w:tcMar>
+            <w:vAlign w:val="center"/>
+          </w:tcPr>
+          <w:p>
+            <w:r>
+              <w:t>Thời gian HTTP nhanh nhất / trung bình cộng / trung vị.</w:t>
+            </w:r>
+          </w:p>
+        </w:tc>
+      </w:tr>
+      <w:tr>
+        <w:trPr>
+          <w:cantSplit/>
+        </w:trPr>
+        <w:tc>
+          <w:tcPr>
+            <w:tcW w:type="dxa" w:w="3312"/>
+            <w:tcBorders>
+              <w:top w:val="single" w:sz="4" w:color="D9D9D9"/>
+              <w:left w:val="single" w:sz="4" w:color="D9D9D9"/>
+              <w:bottom w:val="single" w:sz="4" w:color="D9D9D9"/>
+              <w:right w:val="single" w:sz="4" w:color="D9D9D9"/>
+            </w:tcBorders>
+            <w:tcMar>
+              <w:top w:w="95" w:type="dxa"/>
+              <w:bottom w:w="95" w:type="dxa"/>
+              <w:left w:w="120" w:type="dxa"/>
+              <w:right w:w="120" w:type="dxa"/>
+            </w:tcMar>
+            <w:vAlign w:val="center"/>
+          </w:tcPr>
+          <w:p>
+            <w:r>
+              <w:t>Latency p90 / p95 / max</w:t>
+            </w:r>
+          </w:p>
+        </w:tc>
+        <w:tc>
+          <w:tcPr>
+            <w:tcW w:type="dxa" w:w="6624"/>
+            <w:tcBorders>
+              <w:top w:val="single" w:sz="4" w:color="D9D9D9"/>
+              <w:left w:val="single" w:sz="4" w:color="D9D9D9"/>
+              <w:bottom w:val="single" w:sz="4" w:color="D9D9D9"/>
+              <w:right w:val="single" w:sz="4" w:color="D9D9D9"/>
+            </w:tcBorders>
+            <w:tcMar>
+              <w:top w:w="95" w:type="dxa"/>
+              <w:bottom w:w="95" w:type="dxa"/>
+              <w:left w:w="120" w:type="dxa"/>
+              <w:right w:w="120" w:type="dxa"/>
+            </w:tcMar>
+            <w:vAlign w:val="center"/>
+          </w:tcPr>
+          <w:p>
+            <w:r>
+              <w:t>Mốc 90% / mốc 95% / request chậm nhất; p95 được so với ngưỡng.</w:t>
+            </w:r>
+          </w:p>
+        </w:tc>
+      </w:tr>
+      <w:tr>
+        <w:trPr>
+          <w:cantSplit/>
+        </w:trPr>
+        <w:tc>
+          <w:tcPr>
+            <w:tcW w:type="dxa" w:w="3312"/>
+            <w:shd w:fill="F7FAFB"/>
+            <w:tcBorders>
+              <w:top w:val="single" w:sz="4" w:color="D9D9D9"/>
+              <w:left w:val="single" w:sz="4" w:color="D9D9D9"/>
+              <w:bottom w:val="single" w:sz="4" w:color="D9D9D9"/>
+              <w:right w:val="single" w:sz="4" w:color="D9D9D9"/>
+            </w:tcBorders>
+            <w:tcMar>
+              <w:top w:w="95" w:type="dxa"/>
+              <w:bottom w:w="95" w:type="dxa"/>
+              <w:left w:w="120" w:type="dxa"/>
+              <w:right w:w="120" w:type="dxa"/>
+            </w:tcMar>
+            <w:vAlign w:val="center"/>
+          </w:tcPr>
+          <w:p>
+            <w:r>
+              <w:t>Iterations; Data received</w:t>
+            </w:r>
+          </w:p>
+        </w:tc>
+        <w:tc>
+          <w:tcPr>
+            <w:tcW w:type="dxa" w:w="6624"/>
+            <w:shd w:fill="F7FAFB"/>
+            <w:tcBorders>
+              <w:top w:val="single" w:sz="4" w:color="D9D9D9"/>
+              <w:left w:val="single" w:sz="4" w:color="D9D9D9"/>
+              <w:bottom w:val="single" w:sz="4" w:color="D9D9D9"/>
+              <w:right w:val="single" w:sz="4" w:color="D9D9D9"/>
+            </w:tcBorders>
+            <w:tcMar>
+              <w:top w:w="95" w:type="dxa"/>
+              <w:bottom w:w="95" w:type="dxa"/>
+              <w:left w:w="120" w:type="dxa"/>
+              <w:right w:w="120" w:type="dxa"/>
+            </w:tcMar>
+            <w:vAlign w:val="center"/>
+          </w:tcPr>
+          <w:p>
+            <w:r>
+              <w:t>Vòng lặp k6 hoàn tất; tổng dữ liệu HTTP nhận về tính bằng MB.</w:t>
+            </w:r>
+          </w:p>
+        </w:tc>
+      </w:tr>
+      <w:tr>
+        <w:trPr>
+          <w:cantSplit/>
+        </w:trPr>
+        <w:tc>
+          <w:tcPr>
+            <w:tcW w:type="dxa" w:w="3312"/>
+            <w:tcBorders>
+              <w:top w:val="single" w:sz="4" w:color="D9D9D9"/>
+              <w:left w:val="single" w:sz="4" w:color="D9D9D9"/>
+              <w:bottom w:val="single" w:sz="4" w:color="D9D9D9"/>
+              <w:right w:val="single" w:sz="4" w:color="D9D9D9"/>
+            </w:tcBorders>
+            <w:tcMar>
+              <w:top w:w="95" w:type="dxa"/>
+              <w:bottom w:w="95" w:type="dxa"/>
+              <w:left w:w="120" w:type="dxa"/>
+              <w:right w:w="120" w:type="dxa"/>
+            </w:tcMar>
+            <w:vAlign w:val="center"/>
+          </w:tcPr>
+          <w:p>
+            <w:r>
+              <w:t>Threshold decisions</w:t>
+            </w:r>
+          </w:p>
+        </w:tc>
+        <w:tc>
+          <w:tcPr>
+            <w:tcW w:type="dxa" w:w="6624"/>
+            <w:tcBorders>
+              <w:top w:val="single" w:sz="4" w:color="D9D9D9"/>
+              <w:left w:val="single" w:sz="4" w:color="D9D9D9"/>
+              <w:bottom w:val="single" w:sz="4" w:color="D9D9D9"/>
+              <w:right w:val="single" w:sz="4" w:color="D9D9D9"/>
+            </w:tcBorders>
+            <w:tcMar>
+              <w:top w:w="95" w:type="dxa"/>
+              <w:bottom w:w="95" w:type="dxa"/>
+              <w:left w:w="120" w:type="dxa"/>
+              <w:right w:w="120" w:type="dxa"/>
+            </w:tcMar>
+            <w:vAlign w:val="center"/>
+          </w:tcPr>
+          <w:p>
+            <w:r>
+              <w:t>Hai hàng p95 và Failed requests. Cả hai PASS mới là WITHIN LIMITS.</w:t>
             </w:r>
           </w:p>
         </w:tc>
@@ -2566,8 +2742,11 @@
     </w:tbl>
     <w:p>
       <w:pPr>
-        <w:spacing w:after="0"/>
+        <w:spacing w:after="0" w:before="180"/>
       </w:pPr>
+      <w:r>
+        <w:t>Các bộ đếm Active jobs, Completed và Rejected ở đầu trang phản ánh server từ lúc khởi động, không phải riêng lượt k6 vừa chạy. Bảng k6 result analysis bên dưới mới là kết quả của một lượt test cụ thể. Completed at và Configured peak giúp xác nhận đang xem đúng lượt mới nhất.</w:t>
+      </w:r>
     </w:p>
     <w:p>
       <w:pPr>
@@ -2581,7 +2760,7 @@
     <w:p>
       <w:pPr/>
       <w:r>
-        <w:t>Sau khi bạn mở đúng file JSON, web so hai số đo của k6 với ngưỡng của kịch bản. CẢ p95 VÀ Error rate phải nhỏ hơn ngưỡng, không được bằng. Đây là tiêu chí bài demo, không phải cam kết cho mọi máy.</w:t>
+        <w:t>Sau khi bài k6 hoàn tất, web so p95 và Error rate của lượt đó với hai ngưỡng của kịch bản. CẢ HAI phải nhỏ hơn ngưỡng, không được bằng, mới hiện WITHIN LIMITS. Đây là tiêu chí demo của QA Lab, không phải chuẩn hiệu năng chung cho mọi ứng dụng.</w:t>
       </w:r>
     </w:p>
     <w:tbl>
@@ -2599,6 +2778,7 @@
       <w:tr>
         <w:trPr>
           <w:tblHeader/>
+          <w:cantSplit/>
         </w:trPr>
         <w:tc>
           <w:tcPr>
@@ -2734,6 +2914,9 @@
         </w:tc>
       </w:tr>
       <w:tr>
+        <w:trPr>
+          <w:cantSplit/>
+        </w:trPr>
         <w:tc>
           <w:tcPr>
             <w:tcW w:type="dxa" w:w="1584"/>
@@ -2860,6 +3043,9 @@
         </w:tc>
       </w:tr>
       <w:tr>
+        <w:trPr>
+          <w:cantSplit/>
+        </w:trPr>
         <w:tc>
           <w:tcPr>
             <w:tcW w:type="dxa" w:w="1584"/>
@@ -2990,6 +3176,9 @@
         </w:tc>
       </w:tr>
       <w:tr>
+        <w:trPr>
+          <w:cantSplit/>
+        </w:trPr>
         <w:tc>
           <w:tcPr>
             <w:tcW w:type="dxa" w:w="1584"/>
@@ -3116,6 +3305,9 @@
         </w:tc>
       </w:tr>
       <w:tr>
+        <w:trPr>
+          <w:cantSplit/>
+        </w:trPr>
         <w:tc>
           <w:tcPr>
             <w:tcW w:type="dxa" w:w="1584"/>
@@ -3254,13 +3446,13 @@
     <w:p>
       <w:pPr/>
       <w:r>
-        <w:t>Ví dụ Stress: p95 = 800 ms và lỗi = 4% thì WITHIN LIMITS. p95 = 900 ms hoặc lỗi = 15% thì LIMIT BREACHED vì đã chạm ngưỡng. p95 = 950 ms, lỗi = 4% cũng vượt; p95 = 800 ms, lỗi = 17% cũng vượt. HTTP 200 từ một lần Run probe không có nghĩa cả bài Stress đạt. Nếu k6 chạy xong nhưng LIMIT BREACHED, bạn đã thực hiện bài test thành công; kết quả chỉ nói API chưa đạt tiêu chí đó trong lần đo này.</w:t>
+        <w:t>Ví dụ Stress: p95 = 800 ms và lỗi = 4% thì đạt. p95 = 900 ms hoặc lỗi = 15% là LIMIT BREACHED vì đã chạm ngưỡng. Tại giới hạn 24 job, API có thể trả HTTP 503 nhanh: p95 còn thấp nhưng tỷ lệ lỗi cao. FAIL là kết quả đo hợp lệ, không có nghĩa k6 cài sai. Một lần Run probe HTTP 200 không chứng minh cả bài Stress đạt.</w:t>
       </w:r>
     </w:p>
     <w:p>
       <w:pPr/>
       <w:r>
-        <w:t>Từ viết tắt: VU là người dùng ảo; k6 là công cụ tạo tải; API là nơi web nhận yêu cầu; HTTP 200 là xử lý được, 400 là đầu vào sai, 429 là bị giới hạn tốc độ, 503 là server hết chỗ nhận việc; PBKDF2 là phép tính lặp; iteration là một vòng; ms là phần nghìn giây; MB là đơn vị bộ nhớ; JSON là file kết quả; heap là bộ nhớ chương trình Node đang dùng.</w:t>
+        <w:t>Chữ viết tắt: VU = người dùng ảo; p95/p90 = phân vị 95/90; ms = mili giây; MB = megabyte; API = nơi server nhận request; HTTP 200 = thành công; 429 = giới hạn tốc độ; 503 = từ chối vì đầy; PBKDF2 = phép tính lặp tạo tải CPU; iteration = vòng lặp k6; heap = bộ nhớ của chương trình Node; JSON = định dạng file kết quả.</w:t>
       </w:r>
     </w:p>
     <w:p>
@@ -3275,35 +3467,19 @@
     <w:p>
       <w:pPr/>
       <w:r>
-        <w:t>Code đã có tại https://github.com/ZoeChan189/qa-playground; bước tải ZIP để chạy local nằm ở trang trước. Nếu mỗi bạn muốn thêm một repo riêng để nối Render, không cần upload lại từng file:</w:t>
+        <w:t>Code mới nhất ở https://github.com/ZoeChan189/qa-playground. Mỗi bạn có thể Download ZIP để chạy local; không cần Fork hay tự deploy nếu thầy không yêu cầu. Nếu cần repo riêng để nối Render, không phải upload lại từng file:</w:t>
       </w:r>
     </w:p>
     <w:p>
-      <w:pPr>
-        <w:pStyle w:val="ListNumber"/>
-      </w:pPr>
+      <w:pPr/>
       <w:r>
-        <w:rPr>
-          <w:b/>
-        </w:rPr>
-        <w:t>Fork code.</w:t>
-      </w:r>
-      <w:r>
-        <w:t xml:space="preserve"> Đăng nhập GitHub, mở repo gốc, bấm Fork &gt; Create fork và chọn tài khoản của mình làm Owner. Repo mới có dạng https://github.com/ten-ban/qa-playground.</w:t>
+        <w:t>1. Fork code. Đăng nhập GitHub, mở repo gốc, bấm Fork &gt; Create fork và chọn tài khoản của mình làm Owner. Repo mới có dạng https://github.com/ten-ban/qa-playground.</w:t>
       </w:r>
     </w:p>
     <w:p>
-      <w:pPr>
-        <w:pStyle w:val="ListNumber"/>
-      </w:pPr>
+      <w:pPr/>
       <w:r>
-        <w:rPr>
-          <w:b/>
-        </w:rPr>
-        <w:t>Kiểm tra bản sao.</w:t>
-      </w:r>
-      <w:r>
-        <w:t xml:space="preserve"> Trong repo vừa fork phải thấy package.json, src/, public/, k6/ ở gốc. Không đưa node_modules/, results/, .env hoặc API key lên GitHub.</w:t>
+        <w:t>2. Kiểm tra bản sao. Repo vừa fork cần có package.json, src/, public/, k6/ ở gốc. Không đưa node_modules/, results/, .env hoặc API key lên GitHub.</w:t>
       </w:r>
     </w:p>
     <w:p>
@@ -3316,65 +3492,33 @@
       </w:r>
     </w:p>
     <w:p>
-      <w:pPr>
-        <w:pStyle w:val="ListNumber"/>
-      </w:pPr>
+      <w:pPr/>
       <w:r>
-        <w:rPr>
-          <w:b/>
-        </w:rPr>
-        <w:t>Chọn repo của mình.</w:t>
-      </w:r>
-      <w:r>
-        <w:t xml:space="preserve"> Đăng nhập https://dashboard.render.com/, liên kết GitHub nếu được hỏi, rồi chọn New &gt; Web Service và repository vừa fork. Không chọn Static Site vì web có API Node.</w:t>
-      </w:r>
-    </w:p>
-    <w:p>
-      <w:pPr>
-        <w:pStyle w:val="ListNumber"/>
-      </w:pPr>
-      <w:r>
-        <w:rPr>
-          <w:b/>
-        </w:rPr>
-        <w:t>Điền cách chạy.</w:t>
-      </w:r>
-      <w:r>
-        <w:t xml:space="preserve"> Language/Runtime: Node; Branch: main; Root Directory: để trống; Build Command: npm ci; Start Command: npm start. Chọn Free nếu tài khoản cho phép.</w:t>
-      </w:r>
-    </w:p>
-    <w:p>
-      <w:pPr>
-        <w:pStyle w:val="ListNumber"/>
-      </w:pPr>
-      <w:r>
-        <w:rPr>
-          <w:b/>
-        </w:rPr>
-        <w:t>Đặt Environment.</w:t>
-      </w:r>
-      <w:r>
-        <w:t xml:space="preserve"> Thêm NODE_ENV=production. Health Check Path nếu có: /api/health. Performance không cần Gemini API key.</w:t>
-      </w:r>
-    </w:p>
-    <w:p>
-      <w:pPr>
-        <w:pStyle w:val="ListNumber"/>
-      </w:pPr>
-      <w:r>
-        <w:rPr>
-          <w:b/>
-        </w:rPr>
-        <w:t>Kiểm tra link.</w:t>
-      </w:r>
-      <w:r>
-        <w:t xml:space="preserve"> Bấm Create Web Service/Deploy và chờ Live. Mở link https://...onrender.com của mình, rồi mở thêm https://...onrender.com/api/health; JSON có status: ready và service: qa-lab nghĩa là API chạy.</w:t>
+        <w:t>1. Chọn repo của mình. Đăng nhập https://dashboard.render.com/, liên kết GitHub rồi chọn New &gt; Web Service và repo vừa fork. Không chọn Static Site vì web có API Node.</w:t>
       </w:r>
     </w:p>
     <w:p>
       <w:pPr/>
       <w:r>
-        <w:t>Render chỉ để chia sẻ và demo nhẹ. Mỗi bạn vẫn chạy k6 trên localhost, giữ ba JSON riêng và không gửi tải nặng vào Render. Nếu deploy lỗi, xem Logs, kiểm tra package.json ở gốc repo cùng lệnh npm ci và npm start. Hướng dẫn trực tuyến và đường dẫn nguồn nằm trong docs/for-team.md.</w:t>
+        <w:t>2. Điền cách chạy. Runtime: Node; Branch: main; Root Directory: để trống; Build Command: npm ci; Start Command: npm start. Chọn Free nếu tài khoản cho phép.</w:t>
+      </w:r>
+    </w:p>
+    <w:p>
+      <w:pPr/>
+      <w:r>
+        <w:t>3. Đặt Environment. Thêm NODE_ENV=production. Health Check Path nếu có: /api/health. Performance không cần Gemini API key.</w:t>
+      </w:r>
+    </w:p>
+    <w:p>
+      <w:pPr/>
+      <w:r>
+        <w:t>4. Kiểm tra link. Bấm Create Web Service hoặc Deploy và chờ Live. Mở link Render của mình rồi mở /api/health; JSON có status: ready và service: qa-lab nghĩa là API chạy.</w:t>
+      </w:r>
+    </w:p>
+    <w:p>
+      <w:pPr/>
+      <w:r>
+        <w:t>Render chỉ để chia sẻ giao diện và demo nhẹ. Run probe ở đó thử một request; Run local k6 bị khóa và bảng k6 sẽ trống cho tới khi chọn Open summary. Mỗi bạn vẫn chạy Stress, Spike, Soak trên localhost của mình. Hướng dẫn cập nhật và giải thích toàn bộ chỉ số nằm trong docs/for-team.md.</w:t>
       </w:r>
     </w:p>
     <w:sectPr>

</xml_diff>